<commit_message>
ACDR2026: 10/9 opening speech review, participant list check, name tents update
Co-Authored-By: Claude Opus 5.5 <noreply@anthropic.com>
Claude-Session: https://claude.ai/code/session_011xF77D95cDW5CT1JUxj7vg
</commit_message>
<xml_diff>
--- a/reports/acdr2026_staff_deployment/進行シナリオ_0929/ACDR2026_Emcee_Run_Sheet_and_Briefing_draft1009.docx
+++ b/reports/acdr2026_staff_deployment/進行シナリオ_0929/ACDR2026_Emcee_Run_Sheet_and_Briefing_draft1009.docx
@@ -3164,7 +3164,7 @@
                 <w:sz w:val="18"/>
                 <w:szCs w:val="18"/>
               </w:rPr>
-              <w:t xml:space="preserve">Commissioner SCDF 5 min; Deputy Minister Hayashi 4–5 min, in English; Chairman Miura about 4 min, ends with the declaration of opening. Speakers use the lectern.</w:t>
+              <w:t>Commissioner SCDF 5 min; Deputy Minister Hayashi about 3 min, in English; Chairman Miura about 4 min, ends with the declaration of opening. Speakers use the lectern.</w:t>
             </w:r>
           </w:p>
         </w:tc>
@@ -3899,7 +3899,7 @@
                 <w:sz w:val="18"/>
                 <w:szCs w:val="18"/>
               </w:rPr>
-              <w:t xml:space="preserve">[Speech in English, 4 to 5 minutes]</w:t>
+              <w:t>[Speech in English, about 3 minutes]</w:t>
             </w:r>
           </w:p>
           <w:p>

</xml_diff>